<commit_message>
Add MCI bar chart showing each variable's MCI value toward target variable
</commit_message>
<xml_diff>
--- a/软件著作权申请资料/正式资料/多算法因果分析平台_操作手册.docx
+++ b/软件著作权申请资料/正式资料/多算法因果分析平台_操作手册.docx
@@ -1651,7 +1651,7 @@
       </w:r>
     </w:p>
     <w:sectPr>
-      <w:headerReference w:type="default" r:id="rId11"/>
+      <w:headerReference w:type="default" r:id="rId9"/>
       <w:footerReference w:type="default" r:id="rId10"/>
       <w:pgSz w:w="11906" w:h="16838"/>
       <w:pgMar w:top="850" w:right="794" w:bottom="850" w:left="907" w:header="720" w:footer="720" w:gutter="0"/>
@@ -1678,87 +1678,6 @@
     <w:pPr>
       <w:pStyle w:val="Header"/>
     </w:pPr>
-  </w:p>
-</w:hdr>
-</file>
-
-<file path=word/header_watermark.xml><?xml version="1.0" encoding="utf-8"?>
-<w:hdr xmlns:w="http://schemas.openxmlformats.org/wordprocessingml/2006/main" xmlns:r="http://schemas.openxmlformats.org/officeDocument/2006/relationships" xmlns:wp="http://schemas.openxmlformats.org/drawingml/2006/wordprocessingDrawing" xmlns:a="http://schemas.openxmlformats.org/drawingml/2006/main" xmlns:wps="http://schemas.microsoft.com/office/word/2010/wordprocessingShape" xmlns:mc="http://schemas.openxmlformats.org/markup-compatibility/2006" xmlns:wp14="http://schemas.microsoft.com/office/word/2010/wordprocessingDrawing" xmlns:w14="http://schemas.microsoft.com/office/word/2010/wordml" mc:Ignorable="w14 wp14">
-  <w:p>
-    <w:pPr>
-      <w:pStyle w:val="Header"/>
-    </w:pPr>
-    <w:r>
-      <w:rPr>
-        <w:noProof/>
-      </w:rPr>
-      <mc:AlternateContent>
-        <mc:Choice Requires="wps">
-          <w:drawing>
-            <wp:anchor distT="0" distB="0" distL="0" distR="0" simplePos="0" relativeHeight="251658240" behindDoc="1" locked="0" layoutInCell="0" allowOverlap="1">
-              <wp:simplePos x="0" y="0"/>
-              <wp:positionH relativeFrom="page">
-                <wp:align>right</wp:align>
-              </wp:positionH>
-              <wp:positionV relativeFrom="page">
-                <wp:align>bottom</wp:align>
-              </wp:positionV>
-              <wp:extent cx="2200000" cy="350000"/>
-              <wp:effectExtent l="0" t="0" r="0" b="0"/>
-              <wp:wrapNone/>
-              <wp:docPr id="1" name="Watermark"/>
-              <a:graphic>
-                <a:graphicData uri="http://schemas.microsoft.com/office/word/2010/wordprocessingShape">
-                  <wps:wsp>
-                    <wps:cNvSpPr txBox="1"/>
-                    <wps:spPr>
-                      <a:xfrm rot="0">
-                        <a:off x="0" y="0"/>
-                        <a:ext cx="2200000" cy="350000"/>
-                      </a:xfrm>
-                      <a:prstGeom prst="rect">
-                        <a:avLst/>
-                      </a:prstGeom>
-                      <a:noFill/>
-                      <a:ln>
-                        <a:noFill/>
-                      </a:ln>
-                    </wps:spPr>
-                    <wps:txbx>
-                      <w:txbxContent>
-                        <w:p>
-                          <w:pPr>
-                            <w:jc w:val="right"/>
-                          </w:pPr>
-                          <w:r>
-                            <w:rPr>
-                              <w:sz w:val="32"/>
-                              <w:szCs w:val="32"/>
-                              <w:rFonts w:eastAsia="SimSun" w:ascii="Arial" w:hAnsi="Arial"/>
-                              <w:color w:val="808080"/>
-                              <w14:textFill>
-                                <w14:solidFill>
-                                  <w14:srgbClr w14:val="808080">
-                                    <w14:alpha w14:val="19999"/>
-                                  </w14:srgbClr>
-                                </w14:solidFill>
-                              </w14:textFill>
-                            </w:rPr>
-                            <w:t>TRAE AI 生成</w:t>
-                          </w:r>
-                        </w:p>
-                      </w:txbxContent>
-                    </wps:txbx>
-                    <wps:bodyPr wrap="square" anchor="b" anchorCtr="0" lIns="0" tIns="0" rIns="91440" bIns="45720"/>
-                  </wps:wsp>
-                </a:graphicData>
-              </a:graphic>
-            </wp:anchor>
-          </w:drawing>
-        </mc:Choice>
-        <mc:Fallback/>
-      </mc:AlternateContent>
-    </w:r>
   </w:p>
 </w:hdr>
 </file>

</xml_diff>